<commit_message>
Checkpoint v0.5.5 pre-integracao MPPT: coordenadas, figura, trifasico e startup.
Marco de restauracao antes da topologia MPPT/strings SAJ-DEYE. Ver docs/CHECKPOINT_2026-08-30_pre_mppt.md e CHANGELOG [0.5.5]. Integracao MPPT ainda nao iniciada.

Co-authored-by: Cursor <cursoragent@cursor.com>
</commit_message>
<xml_diff>
--- a/templates/modelo_procuracao_marcadores.docx
+++ b/templates/modelo_procuracao_marcadores.docx
@@ -44,166 +44,310 @@
         <w:jc w:val="both"/>
       </w:pPr>
       <w:r>
+        <w:rPr>
+          <w:rFonts w:ascii="Times New Roman" w:hAnsi="Times New Roman" w:eastAsia="Times New Roman" w:cs="Times New Roman"/>
+          <w:sz w:val="24"/>
+          <w:szCs w:val="24"/>
+        </w:rPr>
         <w:t xml:space="preserve">Por este instrumento de procuração e na melhor forma de direito, o Outorgante: </w:t>
       </w:r>
       <w:r>
         <w:rPr>
-          <w:b/>
-          <w:bCs/>
+          <w:rFonts w:ascii="Times New Roman" w:hAnsi="Times New Roman" w:eastAsia="Times New Roman" w:cs="Times New Roman"/>
+          <w:b/>
+          <w:bCs/>
+          <w:sz w:val="24"/>
+          <w:szCs w:val="24"/>
         </w:rPr>
         <w:t>{{NOME_CLIENTE}}</w:t>
       </w:r>
       <w:r>
+        <w:rPr>
+          <w:rFonts w:ascii="Times New Roman" w:hAnsi="Times New Roman" w:eastAsia="Times New Roman" w:cs="Times New Roman"/>
+          <w:sz w:val="24"/>
+          <w:szCs w:val="24"/>
+        </w:rPr>
         <w:t xml:space="preserve">, portador do CPF nº </w:t>
       </w:r>
       <w:r>
         <w:rPr>
-          <w:b/>
-          <w:bCs/>
+          <w:rFonts w:ascii="Times New Roman" w:hAnsi="Times New Roman" w:eastAsia="Times New Roman" w:cs="Times New Roman"/>
+          <w:b/>
+          <w:bCs/>
+          <w:sz w:val="24"/>
+          <w:szCs w:val="24"/>
         </w:rPr>
         <w:t>{{CPF}}</w:t>
       </w:r>
       <w:r>
+        <w:rPr>
+          <w:rFonts w:ascii="Times New Roman" w:hAnsi="Times New Roman" w:eastAsia="Times New Roman" w:cs="Times New Roman"/>
+          <w:sz w:val="24"/>
+          <w:szCs w:val="24"/>
+        </w:rPr>
         <w:t xml:space="preserve">, RG nº </w:t>
       </w:r>
       <w:r>
         <w:rPr>
-          <w:b/>
-          <w:bCs/>
+          <w:rFonts w:ascii="Times New Roman" w:hAnsi="Times New Roman" w:eastAsia="Times New Roman" w:cs="Times New Roman"/>
+          <w:b/>
+          <w:bCs/>
+          <w:sz w:val="24"/>
+          <w:szCs w:val="24"/>
         </w:rPr>
         <w:t>{{RG}}</w:t>
       </w:r>
       <w:r>
+        <w:rPr>
+          <w:rFonts w:ascii="Times New Roman" w:hAnsi="Times New Roman" w:eastAsia="Times New Roman" w:cs="Times New Roman"/>
+          <w:sz w:val="24"/>
+          <w:szCs w:val="24"/>
+        </w:rPr>
         <w:t xml:space="preserve">, residente e domiciliado à </w:t>
       </w:r>
       <w:r>
         <w:rPr>
-          <w:b/>
-          <w:bCs/>
+          <w:rFonts w:ascii="Times New Roman" w:hAnsi="Times New Roman" w:eastAsia="Times New Roman" w:cs="Times New Roman"/>
+          <w:b/>
+          <w:bCs/>
+          <w:sz w:val="24"/>
+          <w:szCs w:val="24"/>
         </w:rPr>
         <w:t>{{ENDERECO}}</w:t>
       </w:r>
       <w:r>
-        <w:t xml:space="preserve">, Bairro: </w:t>
-      </w:r>
-      <w:r>
-        <w:rPr>
-          <w:b/>
-          <w:bCs/>
+        <w:rPr>
+          <w:rFonts w:ascii="Times New Roman" w:hAnsi="Times New Roman" w:eastAsia="Times New Roman" w:cs="Times New Roman"/>
+          <w:sz w:val="24"/>
+          <w:szCs w:val="24"/>
+        </w:rPr>
+        <w:t xml:space="preserve">, </w:t>
+      </w:r>
+      <w:r>
+        <w:t>{{COMPLEMENTO}},</w:t>
+      </w:r>
+      <w:r>
+        <w:rPr>
+          <w:rFonts w:ascii="Times New Roman" w:hAnsi="Times New Roman" w:eastAsia="Times New Roman" w:cs="Times New Roman"/>
+          <w:sz w:val="24"/>
+          <w:szCs w:val="24"/>
+        </w:rPr>
+        <w:t xml:space="preserve"> Bairro: </w:t>
+      </w:r>
+      <w:r>
+        <w:rPr>
+          <w:rFonts w:ascii="Times New Roman" w:hAnsi="Times New Roman" w:eastAsia="Times New Roman" w:cs="Times New Roman"/>
+          <w:b/>
+          <w:bCs/>
+          <w:sz w:val="24"/>
+          <w:szCs w:val="24"/>
         </w:rPr>
         <w:t>{{BAIRRO}}</w:t>
       </w:r>
       <w:r>
+        <w:rPr>
+          <w:rFonts w:ascii="Times New Roman" w:hAnsi="Times New Roman" w:eastAsia="Times New Roman" w:cs="Times New Roman"/>
+          <w:sz w:val="24"/>
+          <w:szCs w:val="24"/>
+        </w:rPr>
         <w:t xml:space="preserve">, CEP: </w:t>
       </w:r>
       <w:r>
         <w:rPr>
-          <w:b/>
-          <w:bCs/>
+          <w:rFonts w:ascii="Times New Roman" w:hAnsi="Times New Roman" w:eastAsia="Times New Roman" w:cs="Times New Roman"/>
+          <w:b/>
+          <w:bCs/>
+          <w:sz w:val="24"/>
+          <w:szCs w:val="24"/>
         </w:rPr>
         <w:t>{{CEP}}</w:t>
       </w:r>
       <w:r>
+        <w:rPr>
+          <w:rFonts w:ascii="Times New Roman" w:hAnsi="Times New Roman" w:eastAsia="Times New Roman" w:cs="Times New Roman"/>
+          <w:sz w:val="24"/>
+          <w:szCs w:val="24"/>
+        </w:rPr>
         <w:t xml:space="preserve">, em </w:t>
       </w:r>
       <w:r>
         <w:rPr>
-          <w:b/>
-          <w:bCs/>
+          <w:rFonts w:ascii="Times New Roman" w:hAnsi="Times New Roman" w:eastAsia="Times New Roman" w:cs="Times New Roman"/>
+          <w:b/>
+          <w:bCs/>
+          <w:sz w:val="24"/>
+          <w:szCs w:val="24"/>
         </w:rPr>
         <w:t>{{CIDADE}}/{{UF}}</w:t>
       </w:r>
       <w:r>
+        <w:rPr>
+          <w:rFonts w:ascii="Times New Roman" w:hAnsi="Times New Roman" w:eastAsia="Times New Roman" w:cs="Times New Roman"/>
+          <w:sz w:val="24"/>
+          <w:szCs w:val="24"/>
+        </w:rPr>
         <w:t xml:space="preserve">, nomeia e constitui como seu bastante procurador o Outorgado(a): Sr(a). </w:t>
       </w:r>
       <w:r>
         <w:rPr>
-          <w:b/>
-          <w:bCs/>
+          <w:rFonts w:ascii="Times New Roman" w:hAnsi="Times New Roman" w:eastAsia="Times New Roman" w:cs="Times New Roman"/>
+          <w:b/>
+          <w:bCs/>
+          <w:sz w:val="24"/>
+          <w:szCs w:val="24"/>
         </w:rPr>
         <w:t>{{NOME_PROCURADOR}}</w:t>
       </w:r>
       <w:r>
+        <w:rPr>
+          <w:rFonts w:ascii="Times New Roman" w:hAnsi="Times New Roman" w:eastAsia="Times New Roman" w:cs="Times New Roman"/>
+          <w:sz w:val="24"/>
+          <w:szCs w:val="24"/>
+        </w:rPr>
         <w:t xml:space="preserve">, portador do CPF nº </w:t>
       </w:r>
       <w:r>
         <w:rPr>
-          <w:b/>
-          <w:bCs/>
+          <w:rFonts w:ascii="Times New Roman" w:hAnsi="Times New Roman" w:eastAsia="Times New Roman" w:cs="Times New Roman"/>
+          <w:b/>
+          <w:bCs/>
+          <w:sz w:val="24"/>
+          <w:szCs w:val="24"/>
         </w:rPr>
         <w:t>{{CPF_PROCURADOR}}</w:t>
       </w:r>
       <w:r>
+        <w:rPr>
+          <w:rFonts w:ascii="Times New Roman" w:hAnsi="Times New Roman" w:eastAsia="Times New Roman" w:cs="Times New Roman"/>
+          <w:sz w:val="24"/>
+          <w:szCs w:val="24"/>
+        </w:rPr>
         <w:t xml:space="preserve">, RG nº </w:t>
       </w:r>
       <w:r>
         <w:rPr>
-          <w:b/>
-          <w:bCs/>
+          <w:rFonts w:ascii="Times New Roman" w:hAnsi="Times New Roman" w:eastAsia="Times New Roman" w:cs="Times New Roman"/>
+          <w:b/>
+          <w:bCs/>
+          <w:sz w:val="24"/>
+          <w:szCs w:val="24"/>
         </w:rPr>
         <w:t>{{RG_PROCURADOR}}</w:t>
       </w:r>
       <w:r>
+        <w:rPr>
+          <w:rFonts w:ascii="Times New Roman" w:hAnsi="Times New Roman" w:eastAsia="Times New Roman" w:cs="Times New Roman"/>
+          <w:sz w:val="24"/>
+          <w:szCs w:val="24"/>
+        </w:rPr>
         <w:t xml:space="preserve"> expedido pelo </w:t>
       </w:r>
       <w:r>
         <w:rPr>
-          <w:b/>
-          <w:bCs/>
+          <w:rFonts w:ascii="Times New Roman" w:hAnsi="Times New Roman" w:eastAsia="Times New Roman" w:cs="Times New Roman"/>
+          <w:b/>
+          <w:bCs/>
+          <w:sz w:val="24"/>
+          <w:szCs w:val="24"/>
         </w:rPr>
         <w:t>{{ORGAO_EMISSOR_RG_PROCURADOR}}</w:t>
       </w:r>
       <w:r>
+        <w:rPr>
+          <w:rFonts w:ascii="Times New Roman" w:hAnsi="Times New Roman" w:eastAsia="Times New Roman" w:cs="Times New Roman"/>
+          <w:sz w:val="24"/>
+          <w:szCs w:val="24"/>
+        </w:rPr>
         <w:t xml:space="preserve">, registro geral CRT nº </w:t>
       </w:r>
       <w:r>
         <w:rPr>
-          <w:b/>
-          <w:bCs/>
+          <w:rFonts w:ascii="Times New Roman" w:hAnsi="Times New Roman" w:eastAsia="Times New Roman" w:cs="Times New Roman"/>
+          <w:b/>
+          <w:bCs/>
+          <w:sz w:val="24"/>
+          <w:szCs w:val="24"/>
         </w:rPr>
         <w:t>{{REGISTRO_PROFISSIONAL}}</w:t>
       </w:r>
       <w:r>
+        <w:rPr>
+          <w:rFonts w:ascii="Times New Roman" w:hAnsi="Times New Roman" w:eastAsia="Times New Roman" w:cs="Times New Roman"/>
+          <w:sz w:val="24"/>
+          <w:szCs w:val="24"/>
+        </w:rPr>
         <w:t xml:space="preserve">, residente e domiciliado em </w:t>
       </w:r>
       <w:r>
         <w:rPr>
-          <w:b/>
-          <w:bCs/>
+          <w:rFonts w:ascii="Times New Roman" w:hAnsi="Times New Roman" w:eastAsia="Times New Roman" w:cs="Times New Roman"/>
+          <w:b/>
+          <w:bCs/>
+          <w:sz w:val="24"/>
+          <w:szCs w:val="24"/>
         </w:rPr>
         <w:t>{{ENDERECO_PROCURADOR}}</w:t>
       </w:r>
       <w:r>
+        <w:rPr>
+          <w:rFonts w:ascii="Times New Roman" w:hAnsi="Times New Roman" w:eastAsia="Times New Roman" w:cs="Times New Roman"/>
+          <w:sz w:val="24"/>
+          <w:szCs w:val="24"/>
+        </w:rPr>
         <w:t xml:space="preserve">, telefone </w:t>
       </w:r>
       <w:r>
         <w:rPr>
-          <w:b/>
-          <w:bCs/>
+          <w:rFonts w:ascii="Times New Roman" w:hAnsi="Times New Roman" w:eastAsia="Times New Roman" w:cs="Times New Roman"/>
+          <w:b/>
+          <w:bCs/>
+          <w:sz w:val="24"/>
+          <w:szCs w:val="24"/>
         </w:rPr>
         <w:t>{{TELEFONE_PROCURADOR}}</w:t>
       </w:r>
       <w:r>
+        <w:rPr>
+          <w:rFonts w:ascii="Times New Roman" w:hAnsi="Times New Roman" w:eastAsia="Times New Roman" w:cs="Times New Roman"/>
+          <w:sz w:val="24"/>
+          <w:szCs w:val="24"/>
+        </w:rPr>
         <w:t xml:space="preserve">, com poderes para, junto à </w:t>
       </w:r>
       <w:r>
         <w:rPr>
-          <w:b/>
-          <w:bCs/>
+          <w:rFonts w:ascii="Times New Roman" w:hAnsi="Times New Roman" w:eastAsia="Times New Roman" w:cs="Times New Roman"/>
+          <w:b/>
+          <w:bCs/>
+          <w:sz w:val="24"/>
+          <w:szCs w:val="24"/>
         </w:rPr>
         <w:t>{{CONCESSIONARIA}}</w:t>
       </w:r>
       <w:r>
+        <w:rPr>
+          <w:rFonts w:ascii="Times New Roman" w:hAnsi="Times New Roman" w:eastAsia="Times New Roman" w:cs="Times New Roman"/>
+          <w:sz w:val="24"/>
+          <w:szCs w:val="24"/>
+        </w:rPr>
         <w:t xml:space="preserve">, solicitar Liberação de Carga, assinar documentos, cadastros, projetos, firmar termos de compromisso e responsabilidades, enfim praticar todos os atos necessários ao fiel cumprimento deste mandato e, em especial, a viabilidade para instalar o sistema de </w:t>
       </w:r>
       <w:r>
         <w:rPr>
-          <w:b/>
-          <w:bCs/>
+          <w:rFonts w:ascii="Times New Roman" w:hAnsi="Times New Roman" w:eastAsia="Times New Roman" w:cs="Times New Roman"/>
+          <w:b/>
+          <w:bCs/>
+          <w:sz w:val="24"/>
+          <w:szCs w:val="24"/>
         </w:rPr>
         <w:t>{{OBJETO_PROCURACAO}}</w:t>
       </w:r>
       <w:r>
+        <w:rPr>
+          <w:rFonts w:ascii="Times New Roman" w:hAnsi="Times New Roman" w:eastAsia="Times New Roman" w:cs="Times New Roman"/>
+          <w:sz w:val="24"/>
+          <w:szCs w:val="24"/>
+        </w:rPr>
         <w:t xml:space="preserve"> no imóvel supracitado</w:t>
       </w:r>
     </w:p>
@@ -373,7 +517,7 @@
 </file>
 
 <file path=word/footer1.xml><?xml version="1.0" encoding="utf-8"?>
-<w:ftr xmlns:wpc="http://schemas.microsoft.com/office/word/2010/wordprocessingCanvas" xmlns:cx="http://schemas.microsoft.com/office/drawing/2014/chartex" xmlns:cx1="http://schemas.microsoft.com/office/drawing/2015/9/8/chartex" xmlns:cx2="http://schemas.microsoft.com/office/drawing/2015/10/21/chartex" xmlns:cx3="http://schemas.microsoft.com/office/drawing/2016/5/9/chartex" xmlns:cx4="http://schemas.microsoft.com/office/drawing/2016/5/10/chartex" xmlns:cx5="http://schemas.microsoft.com/office/drawing/2016/5/11/chartex" xmlns:cx6="http://schemas.microsoft.com/office/drawing/2016/5/12/chartex" xmlns:cx7="http://schemas.microsoft.com/office/drawing/2016/5/13/chartex" xmlns:cx8="http://schemas.microsoft.com/office/drawing/2016/5/14/chartex" xmlns:mc="http://schemas.openxmlformats.org/markup-compatibility/2006" xmlns:aink="http://schemas.microsoft.com/office/drawing/2016/ink" xmlns:am3d="http://schemas.microsoft.com/office/drawing/2017/model3d" xmlns:o="urn:schemas-microsoft-com:office:office" xmlns:oel="http://schemas.microsoft.com/office/2019/extlst" xmlns:r="http://schemas.openxmlformats.org/officeDocument/2006/relationships" xmlns:m="http://schemas.openxmlformats.org/officeDocument/2006/math" xmlns:v="urn:schemas-microsoft-com:vml" xmlns:wp14="http://schemas.microsoft.com/office/word/2010/wordprocessingDrawing" xmlns:wp="http://schemas.openxmlformats.org/drawingml/2006/wordprocessingDrawing" xmlns:w10="urn:schemas-microsoft-com:office:word" xmlns:w="http://schemas.openxmlformats.org/wordprocessingml/2006/main" xmlns:w14="http://schemas.microsoft.com/office/word/2010/wordml" xmlns:w15="http://schemas.microsoft.com/office/word/2012/wordml" xmlns:w16cex="http://schemas.microsoft.com/office/word/2018/wordml/cex" xmlns:w16cid="http://schemas.microsoft.com/office/word/2016/wordml/cid" xmlns:w16="http://schemas.microsoft.com/office/word/2018/wordml" xmlns:w16du="http://schemas.microsoft.com/office/word/2023/wordml/word16du" xmlns:w16sdtdh="http://schemas.microsoft.com/office/word/2020/wordml/sdtdatahash" xmlns:w16sdtfl="http://schemas.microsoft.com/office/word/2024/wordml/sdtformatlock" xmlns:w16se="http://schemas.microsoft.com/office/word/2015/wordml/symex" xmlns:wpg="http://schemas.microsoft.com/office/word/2010/wordprocessingGroup" xmlns:wpi="http://schemas.microsoft.com/office/word/2010/wordprocessingInk" xmlns:wne="http://schemas.microsoft.com/office/word/2006/wordml" xmlns:wps="http://schemas.microsoft.com/office/word/2010/wordprocessingShape" mc:Ignorable="w14 w15 w16se w16cid w16 w16cex w16sdtdh w16sdtfl w16du wp14">
+<w:ftr xmlns:wpc="http://schemas.microsoft.com/office/word/2010/wordprocessingCanvas" xmlns:mc="http://schemas.openxmlformats.org/markup-compatibility/2006" xmlns:o="urn:schemas-microsoft-com:office:office" xmlns:r="http://schemas.openxmlformats.org/officeDocument/2006/relationships" xmlns:m="http://schemas.openxmlformats.org/officeDocument/2006/math" xmlns:v="urn:schemas-microsoft-com:vml" xmlns:wp14="http://schemas.microsoft.com/office/word/2010/wordprocessingDrawing" xmlns:wp="http://schemas.openxmlformats.org/drawingml/2006/wordprocessingDrawing" xmlns:w10="urn:schemas-microsoft-com:office:word" xmlns:w="http://schemas.openxmlformats.org/wordprocessingml/2006/main" xmlns:w14="http://schemas.microsoft.com/office/word/2010/wordml" xmlns:w15="http://schemas.microsoft.com/office/word/2012/wordml" xmlns:w16se="http://schemas.microsoft.com/office/word/2015/wordml/symex" xmlns:w16cid="http://schemas.microsoft.com/office/word/2016/wordml/cid" xmlns:w16="http://schemas.microsoft.com/office/word/2018/wordml" xmlns:w16cex="http://schemas.microsoft.com/office/word/2018/wordml/cex" xmlns:w16sdtdh="http://schemas.microsoft.com/office/word/2020/wordml/sdtdatahash" xmlns:wne="http://schemas.microsoft.com/office/word/2006/wordml" xmlns:wpg="http://schemas.microsoft.com/office/word/2010/wordprocessingGroup" xmlns:wps="http://schemas.microsoft.com/office/word/2010/wordprocessingShape">
   <w:p>
     <w:pPr>
       <w:pStyle w:val="Rodap"/>
@@ -383,7 +527,7 @@
 </file>
 
 <file path=word/footer2.xml><?xml version="1.0" encoding="utf-8"?>
-<w:ftr xmlns:wpc="http://schemas.microsoft.com/office/word/2010/wordprocessingCanvas" xmlns:cx="http://schemas.microsoft.com/office/drawing/2014/chartex" xmlns:cx1="http://schemas.microsoft.com/office/drawing/2015/9/8/chartex" xmlns:cx2="http://schemas.microsoft.com/office/drawing/2015/10/21/chartex" xmlns:cx3="http://schemas.microsoft.com/office/drawing/2016/5/9/chartex" xmlns:cx4="http://schemas.microsoft.com/office/drawing/2016/5/10/chartex" xmlns:cx5="http://schemas.microsoft.com/office/drawing/2016/5/11/chartex" xmlns:cx6="http://schemas.microsoft.com/office/drawing/2016/5/12/chartex" xmlns:cx7="http://schemas.microsoft.com/office/drawing/2016/5/13/chartex" xmlns:cx8="http://schemas.microsoft.com/office/drawing/2016/5/14/chartex" xmlns:mc="http://schemas.openxmlformats.org/markup-compatibility/2006" xmlns:aink="http://schemas.microsoft.com/office/drawing/2016/ink" xmlns:am3d="http://schemas.microsoft.com/office/drawing/2017/model3d" xmlns:o="urn:schemas-microsoft-com:office:office" xmlns:oel="http://schemas.microsoft.com/office/2019/extlst" xmlns:r="http://schemas.openxmlformats.org/officeDocument/2006/relationships" xmlns:m="http://schemas.openxmlformats.org/officeDocument/2006/math" xmlns:v="urn:schemas-microsoft-com:vml" xmlns:wp14="http://schemas.microsoft.com/office/word/2010/wordprocessingDrawing" xmlns:wp="http://schemas.openxmlformats.org/drawingml/2006/wordprocessingDrawing" xmlns:w10="urn:schemas-microsoft-com:office:word" xmlns:w="http://schemas.openxmlformats.org/wordprocessingml/2006/main" xmlns:w14="http://schemas.microsoft.com/office/word/2010/wordml" xmlns:w15="http://schemas.microsoft.com/office/word/2012/wordml" xmlns:w16cex="http://schemas.microsoft.com/office/word/2018/wordml/cex" xmlns:w16cid="http://schemas.microsoft.com/office/word/2016/wordml/cid" xmlns:w16="http://schemas.microsoft.com/office/word/2018/wordml" xmlns:w16du="http://schemas.microsoft.com/office/word/2023/wordml/word16du" xmlns:w16sdtdh="http://schemas.microsoft.com/office/word/2020/wordml/sdtdatahash" xmlns:w16sdtfl="http://schemas.microsoft.com/office/word/2024/wordml/sdtformatlock" xmlns:w16se="http://schemas.microsoft.com/office/word/2015/wordml/symex" xmlns:wpg="http://schemas.microsoft.com/office/word/2010/wordprocessingGroup" xmlns:wpi="http://schemas.microsoft.com/office/word/2010/wordprocessingInk" xmlns:wne="http://schemas.microsoft.com/office/word/2006/wordml" xmlns:wps="http://schemas.microsoft.com/office/word/2010/wordprocessingShape" mc:Ignorable="w14 w15 w16se w16cid w16 w16cex w16sdtdh w16sdtfl w16du wp14">
+<w:ftr xmlns:wpc="http://schemas.microsoft.com/office/word/2010/wordprocessingCanvas" xmlns:mc="http://schemas.openxmlformats.org/markup-compatibility/2006" xmlns:o="urn:schemas-microsoft-com:office:office" xmlns:r="http://schemas.openxmlformats.org/officeDocument/2006/relationships" xmlns:m="http://schemas.openxmlformats.org/officeDocument/2006/math" xmlns:v="urn:schemas-microsoft-com:vml" xmlns:wp14="http://schemas.microsoft.com/office/word/2010/wordprocessingDrawing" xmlns:wp="http://schemas.openxmlformats.org/drawingml/2006/wordprocessingDrawing" xmlns:w10="urn:schemas-microsoft-com:office:word" xmlns:w="http://schemas.openxmlformats.org/wordprocessingml/2006/main" xmlns:w14="http://schemas.microsoft.com/office/word/2010/wordml" xmlns:w15="http://schemas.microsoft.com/office/word/2012/wordml" xmlns:w16se="http://schemas.microsoft.com/office/word/2015/wordml/symex" xmlns:w16cid="http://schemas.microsoft.com/office/word/2016/wordml/cid" xmlns:w16="http://schemas.microsoft.com/office/word/2018/wordml" xmlns:w16cex="http://schemas.microsoft.com/office/word/2018/wordml/cex" xmlns:w16sdtdh="http://schemas.microsoft.com/office/word/2020/wordml/sdtdatahash" xmlns:wne="http://schemas.microsoft.com/office/word/2006/wordml" xmlns:wpg="http://schemas.microsoft.com/office/word/2010/wordprocessingGroup" xmlns:wps="http://schemas.microsoft.com/office/word/2010/wordprocessingShape">
   <w:p>
     <w:pPr>
       <w:pStyle w:val="Rodap"/>
@@ -436,7 +580,7 @@
 </file>
 
 <file path=word/footer3.xml><?xml version="1.0" encoding="utf-8"?>
-<w:ftr xmlns:wpc="http://schemas.microsoft.com/office/word/2010/wordprocessingCanvas" xmlns:cx="http://schemas.microsoft.com/office/drawing/2014/chartex" xmlns:cx1="http://schemas.microsoft.com/office/drawing/2015/9/8/chartex" xmlns:cx2="http://schemas.microsoft.com/office/drawing/2015/10/21/chartex" xmlns:cx3="http://schemas.microsoft.com/office/drawing/2016/5/9/chartex" xmlns:cx4="http://schemas.microsoft.com/office/drawing/2016/5/10/chartex" xmlns:cx5="http://schemas.microsoft.com/office/drawing/2016/5/11/chartex" xmlns:cx6="http://schemas.microsoft.com/office/drawing/2016/5/12/chartex" xmlns:cx7="http://schemas.microsoft.com/office/drawing/2016/5/13/chartex" xmlns:cx8="http://schemas.microsoft.com/office/drawing/2016/5/14/chartex" xmlns:mc="http://schemas.openxmlformats.org/markup-compatibility/2006" xmlns:aink="http://schemas.microsoft.com/office/drawing/2016/ink" xmlns:am3d="http://schemas.microsoft.com/office/drawing/2017/model3d" xmlns:o="urn:schemas-microsoft-com:office:office" xmlns:oel="http://schemas.microsoft.com/office/2019/extlst" xmlns:r="http://schemas.openxmlformats.org/officeDocument/2006/relationships" xmlns:m="http://schemas.openxmlformats.org/officeDocument/2006/math" xmlns:v="urn:schemas-microsoft-com:vml" xmlns:wp14="http://schemas.microsoft.com/office/word/2010/wordprocessingDrawing" xmlns:wp="http://schemas.openxmlformats.org/drawingml/2006/wordprocessingDrawing" xmlns:w10="urn:schemas-microsoft-com:office:word" xmlns:w="http://schemas.openxmlformats.org/wordprocessingml/2006/main" xmlns:w14="http://schemas.microsoft.com/office/word/2010/wordml" xmlns:w15="http://schemas.microsoft.com/office/word/2012/wordml" xmlns:w16cex="http://schemas.microsoft.com/office/word/2018/wordml/cex" xmlns:w16cid="http://schemas.microsoft.com/office/word/2016/wordml/cid" xmlns:w16="http://schemas.microsoft.com/office/word/2018/wordml" xmlns:w16du="http://schemas.microsoft.com/office/word/2023/wordml/word16du" xmlns:w16sdtdh="http://schemas.microsoft.com/office/word/2020/wordml/sdtdatahash" xmlns:w16sdtfl="http://schemas.microsoft.com/office/word/2024/wordml/sdtformatlock" xmlns:w16se="http://schemas.microsoft.com/office/word/2015/wordml/symex" xmlns:wpg="http://schemas.microsoft.com/office/word/2010/wordprocessingGroup" xmlns:wpi="http://schemas.microsoft.com/office/word/2010/wordprocessingInk" xmlns:wne="http://schemas.microsoft.com/office/word/2006/wordml" xmlns:wps="http://schemas.microsoft.com/office/word/2010/wordprocessingShape" mc:Ignorable="w14 w15 w16se w16cid w16 w16cex w16sdtdh w16sdtfl w16du wp14">
+<w:ftr xmlns:wpc="http://schemas.microsoft.com/office/word/2010/wordprocessingCanvas" xmlns:mc="http://schemas.openxmlformats.org/markup-compatibility/2006" xmlns:o="urn:schemas-microsoft-com:office:office" xmlns:r="http://schemas.openxmlformats.org/officeDocument/2006/relationships" xmlns:m="http://schemas.openxmlformats.org/officeDocument/2006/math" xmlns:v="urn:schemas-microsoft-com:vml" xmlns:wp14="http://schemas.microsoft.com/office/word/2010/wordprocessingDrawing" xmlns:wp="http://schemas.openxmlformats.org/drawingml/2006/wordprocessingDrawing" xmlns:w10="urn:schemas-microsoft-com:office:word" xmlns:w="http://schemas.openxmlformats.org/wordprocessingml/2006/main" xmlns:w14="http://schemas.microsoft.com/office/word/2010/wordml" xmlns:w15="http://schemas.microsoft.com/office/word/2012/wordml" xmlns:w16se="http://schemas.microsoft.com/office/word/2015/wordml/symex" xmlns:w16cid="http://schemas.microsoft.com/office/word/2016/wordml/cid" xmlns:w16="http://schemas.microsoft.com/office/word/2018/wordml" xmlns:w16cex="http://schemas.microsoft.com/office/word/2018/wordml/cex" xmlns:w16sdtdh="http://schemas.microsoft.com/office/word/2020/wordml/sdtdatahash" xmlns:wne="http://schemas.microsoft.com/office/word/2006/wordml" xmlns:wpg="http://schemas.microsoft.com/office/word/2010/wordprocessingGroup" xmlns:wps="http://schemas.microsoft.com/office/word/2010/wordprocessingShape">
   <w:p>
     <w:pPr>
       <w:pStyle w:val="Rodap"/>
@@ -508,7 +652,7 @@
 </file>
 
 <file path=word/header1.xml><?xml version="1.0" encoding="utf-8"?>
-<w:hdr xmlns:wpc="http://schemas.microsoft.com/office/word/2010/wordprocessingCanvas" xmlns:cx="http://schemas.microsoft.com/office/drawing/2014/chartex" xmlns:cx1="http://schemas.microsoft.com/office/drawing/2015/9/8/chartex" xmlns:cx2="http://schemas.microsoft.com/office/drawing/2015/10/21/chartex" xmlns:cx3="http://schemas.microsoft.com/office/drawing/2016/5/9/chartex" xmlns:cx4="http://schemas.microsoft.com/office/drawing/2016/5/10/chartex" xmlns:cx5="http://schemas.microsoft.com/office/drawing/2016/5/11/chartex" xmlns:cx6="http://schemas.microsoft.com/office/drawing/2016/5/12/chartex" xmlns:cx7="http://schemas.microsoft.com/office/drawing/2016/5/13/chartex" xmlns:cx8="http://schemas.microsoft.com/office/drawing/2016/5/14/chartex" xmlns:mc="http://schemas.openxmlformats.org/markup-compatibility/2006" xmlns:aink="http://schemas.microsoft.com/office/drawing/2016/ink" xmlns:am3d="http://schemas.microsoft.com/office/drawing/2017/model3d" xmlns:o="urn:schemas-microsoft-com:office:office" xmlns:oel="http://schemas.microsoft.com/office/2019/extlst" xmlns:r="http://schemas.openxmlformats.org/officeDocument/2006/relationships" xmlns:m="http://schemas.openxmlformats.org/officeDocument/2006/math" xmlns:v="urn:schemas-microsoft-com:vml" xmlns:wp14="http://schemas.microsoft.com/office/word/2010/wordprocessingDrawing" xmlns:wp="http://schemas.openxmlformats.org/drawingml/2006/wordprocessingDrawing" xmlns:w10="urn:schemas-microsoft-com:office:word" xmlns:w="http://schemas.openxmlformats.org/wordprocessingml/2006/main" xmlns:w14="http://schemas.microsoft.com/office/word/2010/wordml" xmlns:w15="http://schemas.microsoft.com/office/word/2012/wordml" xmlns:w16cex="http://schemas.microsoft.com/office/word/2018/wordml/cex" xmlns:w16cid="http://schemas.microsoft.com/office/word/2016/wordml/cid" xmlns:w16="http://schemas.microsoft.com/office/word/2018/wordml" xmlns:w16du="http://schemas.microsoft.com/office/word/2023/wordml/word16du" xmlns:w16sdtdh="http://schemas.microsoft.com/office/word/2020/wordml/sdtdatahash" xmlns:w16sdtfl="http://schemas.microsoft.com/office/word/2024/wordml/sdtformatlock" xmlns:w16se="http://schemas.microsoft.com/office/word/2015/wordml/symex" xmlns:wpg="http://schemas.microsoft.com/office/word/2010/wordprocessingGroup" xmlns:wpi="http://schemas.microsoft.com/office/word/2010/wordprocessingInk" xmlns:wne="http://schemas.microsoft.com/office/word/2006/wordml" xmlns:wps="http://schemas.microsoft.com/office/word/2010/wordprocessingShape" mc:Ignorable="w14 w15 w16se w16cid w16 w16cex w16sdtdh w16sdtfl w16du wp14">
+<w:hdr xmlns:wpc="http://schemas.microsoft.com/office/word/2010/wordprocessingCanvas" xmlns:mc="http://schemas.openxmlformats.org/markup-compatibility/2006" xmlns:o="urn:schemas-microsoft-com:office:office" xmlns:r="http://schemas.openxmlformats.org/officeDocument/2006/relationships" xmlns:m="http://schemas.openxmlformats.org/officeDocument/2006/math" xmlns:v="urn:schemas-microsoft-com:vml" xmlns:wp14="http://schemas.microsoft.com/office/word/2010/wordprocessingDrawing" xmlns:wp="http://schemas.openxmlformats.org/drawingml/2006/wordprocessingDrawing" xmlns:w10="urn:schemas-microsoft-com:office:word" xmlns:w="http://schemas.openxmlformats.org/wordprocessingml/2006/main" xmlns:w14="http://schemas.microsoft.com/office/word/2010/wordml" xmlns:w15="http://schemas.microsoft.com/office/word/2012/wordml" xmlns:w16se="http://schemas.microsoft.com/office/word/2015/wordml/symex" xmlns:w16cid="http://schemas.microsoft.com/office/word/2016/wordml/cid" xmlns:w16="http://schemas.microsoft.com/office/word/2018/wordml" xmlns:w16cex="http://schemas.microsoft.com/office/word/2018/wordml/cex" xmlns:w16sdtdh="http://schemas.microsoft.com/office/word/2020/wordml/sdtdatahash" xmlns:wne="http://schemas.microsoft.com/office/word/2006/wordml" xmlns:wpg="http://schemas.microsoft.com/office/word/2010/wordprocessingGroup" xmlns:wps="http://schemas.microsoft.com/office/word/2010/wordprocessingShape">
   <w:p>
     <w:pPr>
       <w:pStyle w:val="Cabealho"/>
@@ -518,7 +662,7 @@
 </file>
 
 <file path=word/header2.xml><?xml version="1.0" encoding="utf-8"?>
-<w:hdr xmlns:wpc="http://schemas.microsoft.com/office/word/2010/wordprocessingCanvas" xmlns:cx="http://schemas.microsoft.com/office/drawing/2014/chartex" xmlns:cx1="http://schemas.microsoft.com/office/drawing/2015/9/8/chartex" xmlns:cx2="http://schemas.microsoft.com/office/drawing/2015/10/21/chartex" xmlns:cx3="http://schemas.microsoft.com/office/drawing/2016/5/9/chartex" xmlns:cx4="http://schemas.microsoft.com/office/drawing/2016/5/10/chartex" xmlns:cx5="http://schemas.microsoft.com/office/drawing/2016/5/11/chartex" xmlns:cx6="http://schemas.microsoft.com/office/drawing/2016/5/12/chartex" xmlns:cx7="http://schemas.microsoft.com/office/drawing/2016/5/13/chartex" xmlns:cx8="http://schemas.microsoft.com/office/drawing/2016/5/14/chartex" xmlns:mc="http://schemas.openxmlformats.org/markup-compatibility/2006" xmlns:aink="http://schemas.microsoft.com/office/drawing/2016/ink" xmlns:am3d="http://schemas.microsoft.com/office/drawing/2017/model3d" xmlns:o="urn:schemas-microsoft-com:office:office" xmlns:oel="http://schemas.microsoft.com/office/2019/extlst" xmlns:r="http://schemas.openxmlformats.org/officeDocument/2006/relationships" xmlns:m="http://schemas.openxmlformats.org/officeDocument/2006/math" xmlns:v="urn:schemas-microsoft-com:vml" xmlns:wp14="http://schemas.microsoft.com/office/word/2010/wordprocessingDrawing" xmlns:wp="http://schemas.openxmlformats.org/drawingml/2006/wordprocessingDrawing" xmlns:w10="urn:schemas-microsoft-com:office:word" xmlns:w="http://schemas.openxmlformats.org/wordprocessingml/2006/main" xmlns:w14="http://schemas.microsoft.com/office/word/2010/wordml" xmlns:w15="http://schemas.microsoft.com/office/word/2012/wordml" xmlns:w16cex="http://schemas.microsoft.com/office/word/2018/wordml/cex" xmlns:w16cid="http://schemas.microsoft.com/office/word/2016/wordml/cid" xmlns:w16="http://schemas.microsoft.com/office/word/2018/wordml" xmlns:w16du="http://schemas.microsoft.com/office/word/2023/wordml/word16du" xmlns:w16sdtdh="http://schemas.microsoft.com/office/word/2020/wordml/sdtdatahash" xmlns:w16sdtfl="http://schemas.microsoft.com/office/word/2024/wordml/sdtformatlock" xmlns:w16se="http://schemas.microsoft.com/office/word/2015/wordml/symex" xmlns:wpg="http://schemas.microsoft.com/office/word/2010/wordprocessingGroup" xmlns:wpi="http://schemas.microsoft.com/office/word/2010/wordprocessingInk" xmlns:wne="http://schemas.microsoft.com/office/word/2006/wordml" xmlns:wps="http://schemas.microsoft.com/office/word/2010/wordprocessingShape" mc:Ignorable="w14 w15 w16se w16cid w16 w16cex w16sdtdh w16sdtfl w16du wp14">
+<w:hdr xmlns:wpc="http://schemas.microsoft.com/office/word/2010/wordprocessingCanvas" xmlns:mc="http://schemas.openxmlformats.org/markup-compatibility/2006" xmlns:o="urn:schemas-microsoft-com:office:office" xmlns:r="http://schemas.openxmlformats.org/officeDocument/2006/relationships" xmlns:m="http://schemas.openxmlformats.org/officeDocument/2006/math" xmlns:v="urn:schemas-microsoft-com:vml" xmlns:wp14="http://schemas.microsoft.com/office/word/2010/wordprocessingDrawing" xmlns:wp="http://schemas.openxmlformats.org/drawingml/2006/wordprocessingDrawing" xmlns:w10="urn:schemas-microsoft-com:office:word" xmlns:w="http://schemas.openxmlformats.org/wordprocessingml/2006/main" xmlns:w14="http://schemas.microsoft.com/office/word/2010/wordml" xmlns:w15="http://schemas.microsoft.com/office/word/2012/wordml" xmlns:w16se="http://schemas.microsoft.com/office/word/2015/wordml/symex" xmlns:w16cid="http://schemas.microsoft.com/office/word/2016/wordml/cid" xmlns:w16="http://schemas.microsoft.com/office/word/2018/wordml" xmlns:w16cex="http://schemas.microsoft.com/office/word/2018/wordml/cex" xmlns:w16sdtdh="http://schemas.microsoft.com/office/word/2020/wordml/sdtdatahash" xmlns:wne="http://schemas.microsoft.com/office/word/2006/wordml" xmlns:wpg="http://schemas.microsoft.com/office/word/2010/wordprocessingGroup" xmlns:wps="http://schemas.microsoft.com/office/word/2010/wordprocessingShape">
   <w:p>
     <w:pPr>
       <w:pStyle w:val="Cabealho"/>
@@ -529,14 +673,11 @@
       </w:tabs>
     </w:pPr>
     <w:r>
-      <w:rPr>
-        <w:noProof/>
-      </w:rPr>
       <w:drawing>
-        <wp:inline distT="0" distB="0" distL="0" distR="0" wp14:anchorId="3D1CEFEA" wp14:editId="1A2CAE90">
+        <wp:inline distT="0" distB="0" distL="0" distR="0">
           <wp:extent cx="2311400" cy="889000"/>
           <wp:effectExtent l="0" t="0" r="0" b="0"/>
-          <wp:docPr id="1" name="Imagem 1" descr="Equatorial Goiás - Reclame Aqui"/>
+          <wp:docPr id="1" name="image1.png" descr="Equatorial Goiás - Reclame Aqui"/>
           <wp:cNvGraphicFramePr>
             <a:graphicFrameLocks xmlns:a="http://schemas.openxmlformats.org/drawingml/2006/main" noChangeAspect="1"/>
           </wp:cNvGraphicFramePr>
@@ -544,10 +685,8 @@
             <a:graphicData uri="http://schemas.openxmlformats.org/drawingml/2006/picture">
               <pic:pic xmlns:pic="http://schemas.openxmlformats.org/drawingml/2006/picture">
                 <pic:nvPicPr>
-                  <pic:cNvPr id="1" name="Imagem 1" descr="Equatorial Goiás - Reclame Aqui"/>
-                  <pic:cNvPicPr>
-                    <a:picLocks noChangeAspect="1" noChangeArrowheads="1"/>
-                  </pic:cNvPicPr>
+                  <pic:cNvPr id="1" name="image1.png" descr="Equatorial Goiás - Reclame Aqui"/>
+                  <pic:cNvPicPr/>
                 </pic:nvPicPr>
                 <pic:blipFill>
                   <a:blip r:embed="rId1"/>
@@ -556,7 +695,7 @@
                     <a:fillRect/>
                   </a:stretch>
                 </pic:blipFill>
-                <pic:spPr bwMode="auto">
+                <pic:spPr>
                   <a:xfrm>
                     <a:off x="0" y="0"/>
                     <a:ext cx="2311400" cy="889000"/>
@@ -564,7 +703,6 @@
                   <a:prstGeom prst="rect">
                     <a:avLst/>
                   </a:prstGeom>
-                  <a:noFill/>
                 </pic:spPr>
               </pic:pic>
             </a:graphicData>
@@ -580,7 +718,7 @@
 </file>
 
 <file path=word/header3.xml><?xml version="1.0" encoding="utf-8"?>
-<w:hdr xmlns:wpc="http://schemas.microsoft.com/office/word/2010/wordprocessingCanvas" xmlns:cx="http://schemas.microsoft.com/office/drawing/2014/chartex" xmlns:cx1="http://schemas.microsoft.com/office/drawing/2015/9/8/chartex" xmlns:cx2="http://schemas.microsoft.com/office/drawing/2015/10/21/chartex" xmlns:cx3="http://schemas.microsoft.com/office/drawing/2016/5/9/chartex" xmlns:cx4="http://schemas.microsoft.com/office/drawing/2016/5/10/chartex" xmlns:cx5="http://schemas.microsoft.com/office/drawing/2016/5/11/chartex" xmlns:cx6="http://schemas.microsoft.com/office/drawing/2016/5/12/chartex" xmlns:cx7="http://schemas.microsoft.com/office/drawing/2016/5/13/chartex" xmlns:cx8="http://schemas.microsoft.com/office/drawing/2016/5/14/chartex" xmlns:mc="http://schemas.openxmlformats.org/markup-compatibility/2006" xmlns:aink="http://schemas.microsoft.com/office/drawing/2016/ink" xmlns:am3d="http://schemas.microsoft.com/office/drawing/2017/model3d" xmlns:o="urn:schemas-microsoft-com:office:office" xmlns:oel="http://schemas.microsoft.com/office/2019/extlst" xmlns:r="http://schemas.openxmlformats.org/officeDocument/2006/relationships" xmlns:m="http://schemas.openxmlformats.org/officeDocument/2006/math" xmlns:v="urn:schemas-microsoft-com:vml" xmlns:wp14="http://schemas.microsoft.com/office/word/2010/wordprocessingDrawing" xmlns:wp="http://schemas.openxmlformats.org/drawingml/2006/wordprocessingDrawing" xmlns:w10="urn:schemas-microsoft-com:office:word" xmlns:w="http://schemas.openxmlformats.org/wordprocessingml/2006/main" xmlns:w14="http://schemas.microsoft.com/office/word/2010/wordml" xmlns:w15="http://schemas.microsoft.com/office/word/2012/wordml" xmlns:w16cex="http://schemas.microsoft.com/office/word/2018/wordml/cex" xmlns:w16cid="http://schemas.microsoft.com/office/word/2016/wordml/cid" xmlns:w16="http://schemas.microsoft.com/office/word/2018/wordml" xmlns:w16du="http://schemas.microsoft.com/office/word/2023/wordml/word16du" xmlns:w16sdtdh="http://schemas.microsoft.com/office/word/2020/wordml/sdtdatahash" xmlns:w16sdtfl="http://schemas.microsoft.com/office/word/2024/wordml/sdtformatlock" xmlns:w16se="http://schemas.microsoft.com/office/word/2015/wordml/symex" xmlns:wpg="http://schemas.microsoft.com/office/word/2010/wordprocessingGroup" xmlns:wpi="http://schemas.microsoft.com/office/word/2010/wordprocessingInk" xmlns:wne="http://schemas.microsoft.com/office/word/2006/wordml" xmlns:wps="http://schemas.microsoft.com/office/word/2010/wordprocessingShape" mc:Ignorable="w14 w15 w16se w16cid w16 w16cex w16sdtdh w16sdtfl w16du wp14">
+<w:hdr xmlns:wpc="http://schemas.microsoft.com/office/word/2010/wordprocessingCanvas" xmlns:mc="http://schemas.openxmlformats.org/markup-compatibility/2006" xmlns:o="urn:schemas-microsoft-com:office:office" xmlns:r="http://schemas.openxmlformats.org/officeDocument/2006/relationships" xmlns:m="http://schemas.openxmlformats.org/officeDocument/2006/math" xmlns:v="urn:schemas-microsoft-com:vml" xmlns:wp14="http://schemas.microsoft.com/office/word/2010/wordprocessingDrawing" xmlns:wp="http://schemas.openxmlformats.org/drawingml/2006/wordprocessingDrawing" xmlns:w10="urn:schemas-microsoft-com:office:word" xmlns:w="http://schemas.openxmlformats.org/wordprocessingml/2006/main" xmlns:w14="http://schemas.microsoft.com/office/word/2010/wordml" xmlns:w15="http://schemas.microsoft.com/office/word/2012/wordml" xmlns:w16se="http://schemas.microsoft.com/office/word/2015/wordml/symex" xmlns:w16cid="http://schemas.microsoft.com/office/word/2016/wordml/cid" xmlns:w16="http://schemas.microsoft.com/office/word/2018/wordml" xmlns:w16cex="http://schemas.microsoft.com/office/word/2018/wordml/cex" xmlns:w16sdtdh="http://schemas.microsoft.com/office/word/2020/wordml/sdtdatahash" xmlns:wne="http://schemas.microsoft.com/office/word/2006/wordml" xmlns:wpg="http://schemas.microsoft.com/office/word/2010/wordprocessingGroup" xmlns:wps="http://schemas.microsoft.com/office/word/2010/wordprocessingShape">
   <w:p>
     <w:pPr>
       <w:pStyle w:val="Cabealho"/>
@@ -591,14 +729,11 @@
       </w:tabs>
     </w:pPr>
     <w:r>
-      <w:rPr>
-        <w:noProof/>
-      </w:rPr>
       <w:drawing>
-        <wp:inline distT="0" distB="0" distL="0" distR="0" wp14:anchorId="3F3199E3" wp14:editId="6CE96F8E">
+        <wp:inline distT="0" distB="0" distL="0" distR="0">
           <wp:extent cx="2311400" cy="889000"/>
           <wp:effectExtent l="0" t="0" r="0" b="0"/>
-          <wp:docPr id="2" name="Imagem 1" descr="Equatorial Goiás - Reclame Aqui"/>
+          <wp:docPr id="2" name="image1.png" descr="Equatorial Goiás - Reclame Aqui"/>
           <wp:cNvGraphicFramePr>
             <a:graphicFrameLocks xmlns:a="http://schemas.openxmlformats.org/drawingml/2006/main" noChangeAspect="1"/>
           </wp:cNvGraphicFramePr>
@@ -606,10 +741,8 @@
             <a:graphicData uri="http://schemas.openxmlformats.org/drawingml/2006/picture">
               <pic:pic xmlns:pic="http://schemas.openxmlformats.org/drawingml/2006/picture">
                 <pic:nvPicPr>
-                  <pic:cNvPr id="2" name="Imagem 1" descr="Equatorial Goiás - Reclame Aqui"/>
-                  <pic:cNvPicPr>
-                    <a:picLocks noChangeAspect="1" noChangeArrowheads="1"/>
-                  </pic:cNvPicPr>
+                  <pic:cNvPr id="2" name="image1.png" descr="Equatorial Goiás - Reclame Aqui"/>
+                  <pic:cNvPicPr/>
                 </pic:nvPicPr>
                 <pic:blipFill>
                   <a:blip r:embed="rId1"/>
@@ -618,7 +751,7 @@
                     <a:fillRect/>
                   </a:stretch>
                 </pic:blipFill>
-                <pic:spPr bwMode="auto">
+                <pic:spPr>
                   <a:xfrm>
                     <a:off x="0" y="0"/>
                     <a:ext cx="2311400" cy="889000"/>
@@ -626,7 +759,6 @@
                   <a:prstGeom prst="rect">
                     <a:avLst/>
                   </a:prstGeom>
-                  <a:noFill/>
                 </pic:spPr>
               </pic:pic>
             </a:graphicData>

</xml_diff>